<commit_message>
Add final thesis report and PDF
Update final thesis document, add PDF export, and remove outdated thesis files.
</commit_message>
<xml_diff>
--- a/reports/Capstone Fİnal Thesis.docx
+++ b/reports/Capstone Fİnal Thesis.docx
@@ -997,7 +997,7 @@
           <w:r>
             <w:fldChar w:fldCharType="separate"/>
           </w:r>
-          <w:hyperlink w:anchor="_Toc229756175" w:history="1">
+          <w:hyperlink w:anchor="_Toc230038824" w:history="1">
             <w:r>
               <w:rPr>
                 <w:rStyle w:val="Kpr"/>
@@ -1024,7 +1024,7 @@
                 <w:noProof/>
                 <w:webHidden/>
               </w:rPr>
-              <w:instrText xml:space="preserve"> PAGEREF _Toc229756175 \h </w:instrText>
+              <w:instrText xml:space="preserve"> PAGEREF _Toc230038824 \h </w:instrText>
             </w:r>
             <w:r>
               <w:rPr>
@@ -1069,7 +1069,7 @@
               <w14:ligatures w14:val="standardContextual"/>
             </w:rPr>
           </w:pPr>
-          <w:hyperlink w:anchor="_Toc229756176" w:history="1">
+          <w:hyperlink w:anchor="_Toc230038825" w:history="1">
             <w:r>
               <w:rPr>
                 <w:rStyle w:val="Kpr"/>
@@ -1096,7 +1096,7 @@
                 <w:noProof/>
                 <w:webHidden/>
               </w:rPr>
-              <w:instrText xml:space="preserve"> PAGEREF _Toc229756176 \h </w:instrText>
+              <w:instrText xml:space="preserve"> PAGEREF _Toc230038825 \h </w:instrText>
             </w:r>
             <w:r>
               <w:rPr>
@@ -1141,10 +1141,12 @@
               <w14:ligatures w14:val="standardContextual"/>
             </w:rPr>
           </w:pPr>
-          <w:hyperlink w:anchor="_Toc229756177" w:history="1">
+          <w:hyperlink w:anchor="_Toc230038826" w:history="1">
             <w:r>
               <w:rPr>
                 <w:rStyle w:val="Kpr"/>
+                <w:b/>
+                <w:bCs/>
                 <w:noProof/>
               </w:rPr>
               <w:t>1.2 Problem Statement</w:t>
@@ -1168,7 +1170,7 @@
                 <w:noProof/>
                 <w:webHidden/>
               </w:rPr>
-              <w:instrText xml:space="preserve"> PAGEREF _Toc229756177 \h </w:instrText>
+              <w:instrText xml:space="preserve"> PAGEREF _Toc230038826 \h </w:instrText>
             </w:r>
             <w:r>
               <w:rPr>
@@ -1213,10 +1215,12 @@
               <w14:ligatures w14:val="standardContextual"/>
             </w:rPr>
           </w:pPr>
-          <w:hyperlink w:anchor="_Toc229756178" w:history="1">
+          <w:hyperlink w:anchor="_Toc230038827" w:history="1">
             <w:r>
               <w:rPr>
                 <w:rStyle w:val="Kpr"/>
+                <w:b/>
+                <w:bCs/>
                 <w:noProof/>
               </w:rPr>
               <w:t>1.3 Research Aim and Objectives</w:t>
@@ -1240,7 +1244,7 @@
                 <w:noProof/>
                 <w:webHidden/>
               </w:rPr>
-              <w:instrText xml:space="preserve"> PAGEREF _Toc229756178 \h </w:instrText>
+              <w:instrText xml:space="preserve"> PAGEREF _Toc230038827 \h </w:instrText>
             </w:r>
             <w:r>
               <w:rPr>
@@ -1285,10 +1289,12 @@
               <w14:ligatures w14:val="standardContextual"/>
             </w:rPr>
           </w:pPr>
-          <w:hyperlink w:anchor="_Toc229756179" w:history="1">
+          <w:hyperlink w:anchor="_Toc230038828" w:history="1">
             <w:r>
               <w:rPr>
                 <w:rStyle w:val="Kpr"/>
+                <w:b/>
+                <w:bCs/>
                 <w:noProof/>
               </w:rPr>
               <w:t>1.4 Research Questions</w:t>
@@ -1312,7 +1318,7 @@
                 <w:noProof/>
                 <w:webHidden/>
               </w:rPr>
-              <w:instrText xml:space="preserve"> PAGEREF _Toc229756179 \h </w:instrText>
+              <w:instrText xml:space="preserve"> PAGEREF _Toc230038828 \h </w:instrText>
             </w:r>
             <w:r>
               <w:rPr>
@@ -1357,10 +1363,12 @@
               <w14:ligatures w14:val="standardContextual"/>
             </w:rPr>
           </w:pPr>
-          <w:hyperlink w:anchor="_Toc229756180" w:history="1">
+          <w:hyperlink w:anchor="_Toc230038829" w:history="1">
             <w:r>
               <w:rPr>
                 <w:rStyle w:val="Kpr"/>
+                <w:b/>
+                <w:bCs/>
                 <w:noProof/>
               </w:rPr>
               <w:t>1.5 Contributions</w:t>
@@ -1384,7 +1392,7 @@
                 <w:noProof/>
                 <w:webHidden/>
               </w:rPr>
-              <w:instrText xml:space="preserve"> PAGEREF _Toc229756180 \h </w:instrText>
+              <w:instrText xml:space="preserve"> PAGEREF _Toc230038829 \h </w:instrText>
             </w:r>
             <w:r>
               <w:rPr>
@@ -1429,10 +1437,12 @@
               <w14:ligatures w14:val="standardContextual"/>
             </w:rPr>
           </w:pPr>
-          <w:hyperlink w:anchor="_Toc229756181" w:history="1">
+          <w:hyperlink w:anchor="_Toc230038830" w:history="1">
             <w:r>
               <w:rPr>
                 <w:rStyle w:val="Kpr"/>
+                <w:b/>
+                <w:bCs/>
                 <w:noProof/>
               </w:rPr>
               <w:t>1.6 Scope and Limitations</w:t>
@@ -1456,7 +1466,7 @@
                 <w:noProof/>
                 <w:webHidden/>
               </w:rPr>
-              <w:instrText xml:space="preserve"> PAGEREF _Toc229756181 \h </w:instrText>
+              <w:instrText xml:space="preserve"> PAGEREF _Toc230038830 \h </w:instrText>
             </w:r>
             <w:r>
               <w:rPr>
@@ -1501,10 +1511,12 @@
               <w14:ligatures w14:val="standardContextual"/>
             </w:rPr>
           </w:pPr>
-          <w:hyperlink w:anchor="_Toc229756182" w:history="1">
+          <w:hyperlink w:anchor="_Toc230038831" w:history="1">
             <w:r>
               <w:rPr>
                 <w:rStyle w:val="Kpr"/>
+                <w:b/>
+                <w:bCs/>
                 <w:noProof/>
               </w:rPr>
               <w:t>1.7 Structure of the Report</w:t>
@@ -1528,7 +1540,7 @@
                 <w:noProof/>
                 <w:webHidden/>
               </w:rPr>
-              <w:instrText xml:space="preserve"> PAGEREF _Toc229756182 \h </w:instrText>
+              <w:instrText xml:space="preserve"> PAGEREF _Toc230038831 \h </w:instrText>
             </w:r>
             <w:r>
               <w:rPr>
@@ -1573,7 +1585,7 @@
               <w14:ligatures w14:val="standardContextual"/>
             </w:rPr>
           </w:pPr>
-          <w:hyperlink w:anchor="_Toc229756183" w:history="1">
+          <w:hyperlink w:anchor="_Toc230038832" w:history="1">
             <w:r>
               <w:rPr>
                 <w:rStyle w:val="Kpr"/>
@@ -1600,7 +1612,7 @@
                 <w:noProof/>
                 <w:webHidden/>
               </w:rPr>
-              <w:instrText xml:space="preserve"> PAGEREF _Toc229756183 \h </w:instrText>
+              <w:instrText xml:space="preserve"> PAGEREF _Toc230038832 \h </w:instrText>
             </w:r>
             <w:r>
               <w:rPr>
@@ -1645,7 +1657,7 @@
               <w14:ligatures w14:val="standardContextual"/>
             </w:rPr>
           </w:pPr>
-          <w:hyperlink w:anchor="_Toc229756184" w:history="1">
+          <w:hyperlink w:anchor="_Toc230038833" w:history="1">
             <w:r>
               <w:rPr>
                 <w:rStyle w:val="Kpr"/>
@@ -1672,7 +1684,7 @@
                 <w:noProof/>
                 <w:webHidden/>
               </w:rPr>
-              <w:instrText xml:space="preserve"> PAGEREF _Toc229756184 \h </w:instrText>
+              <w:instrText xml:space="preserve"> PAGEREF _Toc230038833 \h </w:instrText>
             </w:r>
             <w:r>
               <w:rPr>
@@ -1717,10 +1729,12 @@
               <w14:ligatures w14:val="standardContextual"/>
             </w:rPr>
           </w:pPr>
-          <w:hyperlink w:anchor="_Toc229756185" w:history="1">
+          <w:hyperlink w:anchor="_Toc230038834" w:history="1">
             <w:r>
               <w:rPr>
                 <w:rStyle w:val="Kpr"/>
+                <w:b/>
+                <w:bCs/>
                 <w:noProof/>
               </w:rPr>
               <w:t>2.2 Classical Sequence-Based Detection (n-grams, STIDE, and Related)</w:t>
@@ -1744,7 +1758,7 @@
                 <w:noProof/>
                 <w:webHidden/>
               </w:rPr>
-              <w:instrText xml:space="preserve"> PAGEREF _Toc229756185 \h </w:instrText>
+              <w:instrText xml:space="preserve"> PAGEREF _Toc230038834 \h </w:instrText>
             </w:r>
             <w:r>
               <w:rPr>
@@ -1789,10 +1803,12 @@
               <w14:ligatures w14:val="standardContextual"/>
             </w:rPr>
           </w:pPr>
-          <w:hyperlink w:anchor="_Toc229756186" w:history="1">
+          <w:hyperlink w:anchor="_Toc230038835" w:history="1">
             <w:r>
               <w:rPr>
                 <w:rStyle w:val="Kpr"/>
+                <w:b/>
+                <w:bCs/>
                 <w:noProof/>
               </w:rPr>
               <w:t>2.3 Statistical and Machine Learning Extensions</w:t>
@@ -1816,7 +1832,7 @@
                 <w:noProof/>
                 <w:webHidden/>
               </w:rPr>
-              <w:instrText xml:space="preserve"> PAGEREF _Toc229756186 \h </w:instrText>
+              <w:instrText xml:space="preserve"> PAGEREF _Toc230038835 \h </w:instrText>
             </w:r>
             <w:r>
               <w:rPr>
@@ -1861,10 +1877,12 @@
               <w14:ligatures w14:val="standardContextual"/>
             </w:rPr>
           </w:pPr>
-          <w:hyperlink w:anchor="_Toc229756187" w:history="1">
+          <w:hyperlink w:anchor="_Toc230038836" w:history="1">
             <w:r>
               <w:rPr>
                 <w:rStyle w:val="Kpr"/>
+                <w:b/>
+                <w:bCs/>
                 <w:noProof/>
               </w:rPr>
               <w:t>2.4 Deep Learning and Sequence Modeling for HIDS</w:t>
@@ -1888,7 +1906,7 @@
                 <w:noProof/>
                 <w:webHidden/>
               </w:rPr>
-              <w:instrText xml:space="preserve"> PAGEREF _Toc229756187 \h </w:instrText>
+              <w:instrText xml:space="preserve"> PAGEREF _Toc230038836 \h </w:instrText>
             </w:r>
             <w:r>
               <w:rPr>
@@ -1933,10 +1951,12 @@
               <w14:ligatures w14:val="standardContextual"/>
             </w:rPr>
           </w:pPr>
-          <w:hyperlink w:anchor="_Toc229756188" w:history="1">
+          <w:hyperlink w:anchor="_Toc230038837" w:history="1">
             <w:r>
               <w:rPr>
                 <w:rStyle w:val="Kpr"/>
+                <w:b/>
+                <w:bCs/>
                 <w:noProof/>
               </w:rPr>
               <w:t>2.5 Datasets and Benchmark Evolution</w:t>
@@ -1960,7 +1980,7 @@
                 <w:noProof/>
                 <w:webHidden/>
               </w:rPr>
-              <w:instrText xml:space="preserve"> PAGEREF _Toc229756188 \h </w:instrText>
+              <w:instrText xml:space="preserve"> PAGEREF _Toc230038837 \h </w:instrText>
             </w:r>
             <w:r>
               <w:rPr>
@@ -2005,10 +2025,12 @@
               <w14:ligatures w14:val="standardContextual"/>
             </w:rPr>
           </w:pPr>
-          <w:hyperlink w:anchor="_Toc229756189" w:history="1">
+          <w:hyperlink w:anchor="_Toc230038838" w:history="1">
             <w:r>
               <w:rPr>
                 <w:rStyle w:val="Kpr"/>
+                <w:b/>
+                <w:bCs/>
                 <w:noProof/>
               </w:rPr>
               <w:t>2.6 Thresholding, Evaluation, and False Positives</w:t>
@@ -2032,7 +2054,7 @@
                 <w:noProof/>
                 <w:webHidden/>
               </w:rPr>
-              <w:instrText xml:space="preserve"> PAGEREF _Toc229756189 \h </w:instrText>
+              <w:instrText xml:space="preserve"> PAGEREF _Toc230038838 \h </w:instrText>
             </w:r>
             <w:r>
               <w:rPr>
@@ -2077,7 +2099,7 @@
               <w14:ligatures w14:val="standardContextual"/>
             </w:rPr>
           </w:pPr>
-          <w:hyperlink w:anchor="_Toc229756190" w:history="1">
+          <w:hyperlink w:anchor="_Toc230038839" w:history="1">
             <w:r>
               <w:rPr>
                 <w:rStyle w:val="Kpr"/>
@@ -2104,7 +2126,7 @@
                 <w:noProof/>
                 <w:webHidden/>
               </w:rPr>
-              <w:instrText xml:space="preserve"> PAGEREF _Toc229756190 \h </w:instrText>
+              <w:instrText xml:space="preserve"> PAGEREF _Toc230038839 \h </w:instrText>
             </w:r>
             <w:r>
               <w:rPr>
@@ -2149,13 +2171,27 @@
               <w14:ligatures w14:val="standardContextual"/>
             </w:rPr>
           </w:pPr>
-          <w:hyperlink w:anchor="_Toc229756191" w:history="1">
+          <w:hyperlink w:anchor="_Toc230038840" w:history="1">
             <w:r>
               <w:rPr>
                 <w:rStyle w:val="Kpr"/>
                 <w:noProof/>
               </w:rPr>
-              <w:t>2.8 Research Gap</w:t>
+              <w:t>2.8 Resea</w:t>
+            </w:r>
+            <w:r>
+              <w:rPr>
+                <w:rStyle w:val="Kpr"/>
+                <w:noProof/>
+              </w:rPr>
+              <w:t>r</w:t>
+            </w:r>
+            <w:r>
+              <w:rPr>
+                <w:rStyle w:val="Kpr"/>
+                <w:noProof/>
+              </w:rPr>
+              <w:t>ch Gap</w:t>
             </w:r>
             <w:r>
               <w:rPr>
@@ -2176,7 +2212,7 @@
                 <w:noProof/>
                 <w:webHidden/>
               </w:rPr>
-              <w:instrText xml:space="preserve"> PAGEREF _Toc229756191 \h </w:instrText>
+              <w:instrText xml:space="preserve"> PAGEREF _Toc230038840 \h </w:instrText>
             </w:r>
             <w:r>
               <w:rPr>
@@ -2221,7 +2257,7 @@
               <w14:ligatures w14:val="standardContextual"/>
             </w:rPr>
           </w:pPr>
-          <w:hyperlink w:anchor="_Toc229756192" w:history="1">
+          <w:hyperlink w:anchor="_Toc230038841" w:history="1">
             <w:r>
               <w:rPr>
                 <w:rStyle w:val="Kpr"/>
@@ -2248,7 +2284,7 @@
                 <w:noProof/>
                 <w:webHidden/>
               </w:rPr>
-              <w:instrText xml:space="preserve"> PAGEREF _Toc229756192 \h </w:instrText>
+              <w:instrText xml:space="preserve"> PAGEREF _Toc230038841 \h </w:instrText>
             </w:r>
             <w:r>
               <w:rPr>
@@ -2293,10 +2329,12 @@
               <w14:ligatures w14:val="standardContextual"/>
             </w:rPr>
           </w:pPr>
-          <w:hyperlink w:anchor="_Toc229756193" w:history="1">
+          <w:hyperlink w:anchor="_Toc230038842" w:history="1">
             <w:r>
               <w:rPr>
                 <w:rStyle w:val="Kpr"/>
+                <w:b/>
+                <w:bCs/>
                 <w:noProof/>
               </w:rPr>
               <w:t>3.1 Research Design</w:t>
@@ -2320,7 +2358,7 @@
                 <w:noProof/>
                 <w:webHidden/>
               </w:rPr>
-              <w:instrText xml:space="preserve"> PAGEREF _Toc229756193 \h </w:instrText>
+              <w:instrText xml:space="preserve"> PAGEREF _Toc230038842 \h </w:instrText>
             </w:r>
             <w:r>
               <w:rPr>
@@ -2365,10 +2403,12 @@
               <w14:ligatures w14:val="standardContextual"/>
             </w:rPr>
           </w:pPr>
-          <w:hyperlink w:anchor="_Toc229756194" w:history="1">
+          <w:hyperlink w:anchor="_Toc230038843" w:history="1">
             <w:r>
               <w:rPr>
                 <w:rStyle w:val="Kpr"/>
+                <w:b/>
+                <w:bCs/>
                 <w:noProof/>
               </w:rPr>
               <w:t>3.2 Dataset and Case Description</w:t>
@@ -2392,7 +2432,7 @@
                 <w:noProof/>
                 <w:webHidden/>
               </w:rPr>
-              <w:instrText xml:space="preserve"> PAGEREF _Toc229756194 \h </w:instrText>
+              <w:instrText xml:space="preserve"> PAGEREF _Toc230038843 \h </w:instrText>
             </w:r>
             <w:r>
               <w:rPr>
@@ -2437,10 +2477,12 @@
               <w14:ligatures w14:val="standardContextual"/>
             </w:rPr>
           </w:pPr>
-          <w:hyperlink w:anchor="_Toc229756195" w:history="1">
+          <w:hyperlink w:anchor="_Toc230038844" w:history="1">
             <w:r>
               <w:rPr>
                 <w:rStyle w:val="Kpr"/>
+                <w:b/>
+                <w:bCs/>
                 <w:noProof/>
               </w:rPr>
               <w:t>3.3 Parsing and Preprocessing Pipeline</w:t>
@@ -2464,7 +2506,7 @@
                 <w:noProof/>
                 <w:webHidden/>
               </w:rPr>
-              <w:instrText xml:space="preserve"> PAGEREF _Toc229756195 \h </w:instrText>
+              <w:instrText xml:space="preserve"> PAGEREF _Toc230038844 \h </w:instrText>
             </w:r>
             <w:r>
               <w:rPr>
@@ -2509,10 +2551,12 @@
               <w14:ligatures w14:val="standardContextual"/>
             </w:rPr>
           </w:pPr>
-          <w:hyperlink w:anchor="_Toc229756196" w:history="1">
+          <w:hyperlink w:anchor="_Toc230038845" w:history="1">
             <w:r>
               <w:rPr>
                 <w:rStyle w:val="Kpr"/>
+                <w:b/>
+                <w:bCs/>
                 <w:noProof/>
               </w:rPr>
               <w:t>3.4 Thread-Based Window Construction</w:t>
@@ -2536,7 +2580,7 @@
                 <w:noProof/>
                 <w:webHidden/>
               </w:rPr>
-              <w:instrText xml:space="preserve"> PAGEREF _Toc229756196 \h </w:instrText>
+              <w:instrText xml:space="preserve"> PAGEREF _Toc230038845 \h </w:instrText>
             </w:r>
             <w:r>
               <w:rPr>
@@ -2581,10 +2625,12 @@
               <w14:ligatures w14:val="standardContextual"/>
             </w:rPr>
           </w:pPr>
-          <w:hyperlink w:anchor="_Toc229756197" w:history="1">
+          <w:hyperlink w:anchor="_Toc230038846" w:history="1">
             <w:r>
               <w:rPr>
                 <w:rStyle w:val="Kpr"/>
+                <w:b/>
+                <w:bCs/>
                 <w:noProof/>
               </w:rPr>
               <w:t>3.5 Feature Encoding</w:t>
@@ -2608,7 +2654,7 @@
                 <w:noProof/>
                 <w:webHidden/>
               </w:rPr>
-              <w:instrText xml:space="preserve"> PAGEREF _Toc229756197 \h </w:instrText>
+              <w:instrText xml:space="preserve"> PAGEREF _Toc230038846 \h </w:instrText>
             </w:r>
             <w:r>
               <w:rPr>
@@ -2653,10 +2699,12 @@
               <w14:ligatures w14:val="standardContextual"/>
             </w:rPr>
           </w:pPr>
-          <w:hyperlink w:anchor="_Toc229756198" w:history="1">
+          <w:hyperlink w:anchor="_Toc230038847" w:history="1">
             <w:r>
               <w:rPr>
                 <w:rStyle w:val="Kpr"/>
+                <w:b/>
+                <w:bCs/>
                 <w:noProof/>
               </w:rPr>
               <w:t>3.6 Models and Training Configuration</w:t>
@@ -2680,7 +2728,7 @@
                 <w:noProof/>
                 <w:webHidden/>
               </w:rPr>
-              <w:instrText xml:space="preserve"> PAGEREF _Toc229756198 \h </w:instrText>
+              <w:instrText xml:space="preserve"> PAGEREF _Toc230038847 \h </w:instrText>
             </w:r>
             <w:r>
               <w:rPr>
@@ -2725,10 +2773,12 @@
               <w14:ligatures w14:val="standardContextual"/>
             </w:rPr>
           </w:pPr>
-          <w:hyperlink w:anchor="_Toc229756199" w:history="1">
+          <w:hyperlink w:anchor="_Toc230038848" w:history="1">
             <w:r>
               <w:rPr>
                 <w:rStyle w:val="Kpr"/>
+                <w:b/>
+                <w:bCs/>
                 <w:noProof/>
               </w:rPr>
               <w:t>3.7 Trace-Level Aggregation and Thresholding</w:t>
@@ -2752,7 +2802,7 @@
                 <w:noProof/>
                 <w:webHidden/>
               </w:rPr>
-              <w:instrText xml:space="preserve"> PAGEREF _Toc229756199 \h </w:instrText>
+              <w:instrText xml:space="preserve"> PAGEREF _Toc230038848 \h </w:instrText>
             </w:r>
             <w:r>
               <w:rPr>
@@ -2797,10 +2847,12 @@
               <w14:ligatures w14:val="standardContextual"/>
             </w:rPr>
           </w:pPr>
-          <w:hyperlink w:anchor="_Toc229756200" w:history="1">
+          <w:hyperlink w:anchor="_Toc230038849" w:history="1">
             <w:r>
               <w:rPr>
                 <w:rStyle w:val="Kpr"/>
+                <w:b/>
+                <w:bCs/>
                 <w:noProof/>
               </w:rPr>
               <w:t>3.8 Evaluation Metrics</w:t>
@@ -2824,7 +2876,7 @@
                 <w:noProof/>
                 <w:webHidden/>
               </w:rPr>
-              <w:instrText xml:space="preserve"> PAGEREF _Toc229756200 \h </w:instrText>
+              <w:instrText xml:space="preserve"> PAGEREF _Toc230038849 \h </w:instrText>
             </w:r>
             <w:r>
               <w:rPr>
@@ -2869,10 +2921,12 @@
               <w14:ligatures w14:val="standardContextual"/>
             </w:rPr>
           </w:pPr>
-          <w:hyperlink w:anchor="_Toc229756201" w:history="1">
+          <w:hyperlink w:anchor="_Toc230038850" w:history="1">
             <w:r>
               <w:rPr>
                 <w:rStyle w:val="Kpr"/>
+                <w:b/>
+                <w:bCs/>
                 <w:noProof/>
               </w:rPr>
               <w:t>3.9 Implementation Environment and Repository Structure</w:t>
@@ -2896,7 +2950,7 @@
                 <w:noProof/>
                 <w:webHidden/>
               </w:rPr>
-              <w:instrText xml:space="preserve"> PAGEREF _Toc229756201 \h </w:instrText>
+              <w:instrText xml:space="preserve"> PAGEREF _Toc230038850 \h </w:instrText>
             </w:r>
             <w:r>
               <w:rPr>
@@ -2941,10 +2995,12 @@
               <w14:ligatures w14:val="standardContextual"/>
             </w:rPr>
           </w:pPr>
-          <w:hyperlink w:anchor="_Toc229756202" w:history="1">
+          <w:hyperlink w:anchor="_Toc230038851" w:history="1">
             <w:r>
               <w:rPr>
                 <w:rStyle w:val="Kpr"/>
+                <w:b/>
+                <w:bCs/>
                 <w:noProof/>
               </w:rPr>
               <w:t>3.10 Dataset and Experimental Setup Summary</w:t>
@@ -2968,7 +3024,7 @@
                 <w:noProof/>
                 <w:webHidden/>
               </w:rPr>
-              <w:instrText xml:space="preserve"> PAGEREF _Toc229756202 \h </w:instrText>
+              <w:instrText xml:space="preserve"> PAGEREF _Toc230038851 \h </w:instrText>
             </w:r>
             <w:r>
               <w:rPr>
@@ -3013,7 +3069,7 @@
               <w14:ligatures w14:val="standardContextual"/>
             </w:rPr>
           </w:pPr>
-          <w:hyperlink w:anchor="_Toc229756203" w:history="1">
+          <w:hyperlink w:anchor="_Toc230038852" w:history="1">
             <w:r>
               <w:rPr>
                 <w:rStyle w:val="Kpr"/>
@@ -3040,7 +3096,7 @@
                 <w:noProof/>
                 <w:webHidden/>
               </w:rPr>
-              <w:instrText xml:space="preserve"> PAGEREF _Toc229756203 \h </w:instrText>
+              <w:instrText xml:space="preserve"> PAGEREF _Toc230038852 \h </w:instrText>
             </w:r>
             <w:r>
               <w:rPr>
@@ -3085,7 +3141,7 @@
               <w14:ligatures w14:val="standardContextual"/>
             </w:rPr>
           </w:pPr>
-          <w:hyperlink w:anchor="_Toc229756204" w:history="1">
+          <w:hyperlink w:anchor="_Toc230038853" w:history="1">
             <w:r>
               <w:rPr>
                 <w:rStyle w:val="Kpr"/>
@@ -3112,7 +3168,7 @@
                 <w:noProof/>
                 <w:webHidden/>
               </w:rPr>
-              <w:instrText xml:space="preserve"> PAGEREF _Toc229756204 \h </w:instrText>
+              <w:instrText xml:space="preserve"> PAGEREF _Toc230038853 \h </w:instrText>
             </w:r>
             <w:r>
               <w:rPr>
@@ -3157,7 +3213,7 @@
               <w14:ligatures w14:val="standardContextual"/>
             </w:rPr>
           </w:pPr>
-          <w:hyperlink w:anchor="_Toc229756205" w:history="1">
+          <w:hyperlink w:anchor="_Toc230038854" w:history="1">
             <w:r>
               <w:rPr>
                 <w:rStyle w:val="Kpr"/>
@@ -3184,7 +3240,7 @@
                 <w:noProof/>
                 <w:webHidden/>
               </w:rPr>
-              <w:instrText xml:space="preserve"> PAGEREF _Toc229756205 \h </w:instrText>
+              <w:instrText xml:space="preserve"> PAGEREF _Toc230038854 \h </w:instrText>
             </w:r>
             <w:r>
               <w:rPr>
@@ -3229,7 +3285,7 @@
               <w14:ligatures w14:val="standardContextual"/>
             </w:rPr>
           </w:pPr>
-          <w:hyperlink w:anchor="_Toc229756206" w:history="1">
+          <w:hyperlink w:anchor="_Toc230038855" w:history="1">
             <w:r>
               <w:rPr>
                 <w:rStyle w:val="Kpr"/>
@@ -3256,7 +3312,7 @@
                 <w:noProof/>
                 <w:webHidden/>
               </w:rPr>
-              <w:instrText xml:space="preserve"> PAGEREF _Toc229756206 \h </w:instrText>
+              <w:instrText xml:space="preserve"> PAGEREF _Toc230038855 \h </w:instrText>
             </w:r>
             <w:r>
               <w:rPr>
@@ -3301,7 +3357,7 @@
               <w14:ligatures w14:val="standardContextual"/>
             </w:rPr>
           </w:pPr>
-          <w:hyperlink w:anchor="_Toc229756207" w:history="1">
+          <w:hyperlink w:anchor="_Toc230038856" w:history="1">
             <w:r>
               <w:rPr>
                 <w:rStyle w:val="Kpr"/>
@@ -3328,7 +3384,7 @@
                 <w:noProof/>
                 <w:webHidden/>
               </w:rPr>
-              <w:instrText xml:space="preserve"> PAGEREF _Toc229756207 \h </w:instrText>
+              <w:instrText xml:space="preserve"> PAGEREF _Toc230038856 \h </w:instrText>
             </w:r>
             <w:r>
               <w:rPr>
@@ -3373,7 +3429,7 @@
               <w14:ligatures w14:val="standardContextual"/>
             </w:rPr>
           </w:pPr>
-          <w:hyperlink w:anchor="_Toc229756208" w:history="1">
+          <w:hyperlink w:anchor="_Toc230038857" w:history="1">
             <w:r>
               <w:rPr>
                 <w:rStyle w:val="Kpr"/>
@@ -3400,7 +3456,7 @@
                 <w:noProof/>
                 <w:webHidden/>
               </w:rPr>
-              <w:instrText xml:space="preserve"> PAGEREF _Toc229756208 \h </w:instrText>
+              <w:instrText xml:space="preserve"> PAGEREF _Toc230038857 \h </w:instrText>
             </w:r>
             <w:r>
               <w:rPr>
@@ -3445,7 +3501,7 @@
               <w14:ligatures w14:val="standardContextual"/>
             </w:rPr>
           </w:pPr>
-          <w:hyperlink w:anchor="_Toc229756209" w:history="1">
+          <w:hyperlink w:anchor="_Toc230038858" w:history="1">
             <w:r>
               <w:rPr>
                 <w:rStyle w:val="Kpr"/>
@@ -3472,7 +3528,7 @@
                 <w:noProof/>
                 <w:webHidden/>
               </w:rPr>
-              <w:instrText xml:space="preserve"> PAGEREF _Toc229756209 \h </w:instrText>
+              <w:instrText xml:space="preserve"> PAGEREF _Toc230038858 \h </w:instrText>
             </w:r>
             <w:r>
               <w:rPr>
@@ -3492,7 +3548,7 @@
                 <w:noProof/>
                 <w:webHidden/>
               </w:rPr>
-              <w:t>18</w:t>
+              <w:t>19</w:t>
             </w:r>
             <w:r>
               <w:rPr>
@@ -3517,7 +3573,7 @@
               <w14:ligatures w14:val="standardContextual"/>
             </w:rPr>
           </w:pPr>
-          <w:hyperlink w:anchor="_Toc229756210" w:history="1">
+          <w:hyperlink w:anchor="_Toc230038859" w:history="1">
             <w:r>
               <w:rPr>
                 <w:rStyle w:val="Kpr"/>
@@ -3544,7 +3600,7 @@
                 <w:noProof/>
                 <w:webHidden/>
               </w:rPr>
-              <w:instrText xml:space="preserve"> PAGEREF _Toc229756210 \h </w:instrText>
+              <w:instrText xml:space="preserve"> PAGEREF _Toc230038859 \h </w:instrText>
             </w:r>
             <w:r>
               <w:rPr>
@@ -3564,7 +3620,7 @@
                 <w:noProof/>
                 <w:webHidden/>
               </w:rPr>
-              <w:t>19</w:t>
+              <w:t>20</w:t>
             </w:r>
             <w:r>
               <w:rPr>
@@ -3589,7 +3645,7 @@
               <w14:ligatures w14:val="standardContextual"/>
             </w:rPr>
           </w:pPr>
-          <w:hyperlink w:anchor="_Toc229756211" w:history="1">
+          <w:hyperlink w:anchor="_Toc230038860" w:history="1">
             <w:r>
               <w:rPr>
                 <w:rStyle w:val="Kpr"/>
@@ -3616,7 +3672,7 @@
                 <w:noProof/>
                 <w:webHidden/>
               </w:rPr>
-              <w:instrText xml:space="preserve"> PAGEREF _Toc229756211 \h </w:instrText>
+              <w:instrText xml:space="preserve"> PAGEREF _Toc230038860 \h </w:instrText>
             </w:r>
             <w:r>
               <w:rPr>
@@ -3636,7 +3692,7 @@
                 <w:noProof/>
                 <w:webHidden/>
               </w:rPr>
-              <w:t>21</w:t>
+              <w:t>22</w:t>
             </w:r>
             <w:r>
               <w:rPr>
@@ -3661,7 +3717,7 @@
               <w14:ligatures w14:val="standardContextual"/>
             </w:rPr>
           </w:pPr>
-          <w:hyperlink w:anchor="_Toc229756212" w:history="1">
+          <w:hyperlink w:anchor="_Toc230038861" w:history="1">
             <w:r>
               <w:rPr>
                 <w:rStyle w:val="Kpr"/>
@@ -3688,7 +3744,7 @@
                 <w:noProof/>
                 <w:webHidden/>
               </w:rPr>
-              <w:instrText xml:space="preserve"> PAGEREF _Toc229756212 \h </w:instrText>
+              <w:instrText xml:space="preserve"> PAGEREF _Toc230038861 \h </w:instrText>
             </w:r>
             <w:r>
               <w:rPr>
@@ -3708,7 +3764,7 @@
                 <w:noProof/>
                 <w:webHidden/>
               </w:rPr>
-              <w:t>21</w:t>
+              <w:t>22</w:t>
             </w:r>
             <w:r>
               <w:rPr>
@@ -3733,7 +3789,7 @@
               <w14:ligatures w14:val="standardContextual"/>
             </w:rPr>
           </w:pPr>
-          <w:hyperlink w:anchor="_Toc229756213" w:history="1">
+          <w:hyperlink w:anchor="_Toc230038862" w:history="1">
             <w:r>
               <w:rPr>
                 <w:rStyle w:val="Kpr"/>
@@ -3760,7 +3816,7 @@
                 <w:noProof/>
                 <w:webHidden/>
               </w:rPr>
-              <w:instrText xml:space="preserve"> PAGEREF _Toc229756213 \h </w:instrText>
+              <w:instrText xml:space="preserve"> PAGEREF _Toc230038862 \h </w:instrText>
             </w:r>
             <w:r>
               <w:rPr>
@@ -3780,7 +3836,7 @@
                 <w:noProof/>
                 <w:webHidden/>
               </w:rPr>
-              <w:t>21</w:t>
+              <w:t>22</w:t>
             </w:r>
             <w:r>
               <w:rPr>
@@ -3805,7 +3861,7 @@
               <w14:ligatures w14:val="standardContextual"/>
             </w:rPr>
           </w:pPr>
-          <w:hyperlink w:anchor="_Toc229756214" w:history="1">
+          <w:hyperlink w:anchor="_Toc230038863" w:history="1">
             <w:r>
               <w:rPr>
                 <w:rStyle w:val="Kpr"/>
@@ -3832,7 +3888,7 @@
                 <w:noProof/>
                 <w:webHidden/>
               </w:rPr>
-              <w:instrText xml:space="preserve"> PAGEREF _Toc229756214 \h </w:instrText>
+              <w:instrText xml:space="preserve"> PAGEREF _Toc230038863 \h </w:instrText>
             </w:r>
             <w:r>
               <w:rPr>
@@ -3852,7 +3908,7 @@
                 <w:noProof/>
                 <w:webHidden/>
               </w:rPr>
-              <w:t>21</w:t>
+              <w:t>22</w:t>
             </w:r>
             <w:r>
               <w:rPr>
@@ -3877,7 +3933,7 @@
               <w14:ligatures w14:val="standardContextual"/>
             </w:rPr>
           </w:pPr>
-          <w:hyperlink w:anchor="_Toc229756215" w:history="1">
+          <w:hyperlink w:anchor="_Toc230038864" w:history="1">
             <w:r>
               <w:rPr>
                 <w:rStyle w:val="Kpr"/>
@@ -3904,7 +3960,7 @@
                 <w:noProof/>
                 <w:webHidden/>
               </w:rPr>
-              <w:instrText xml:space="preserve"> PAGEREF _Toc229756215 \h </w:instrText>
+              <w:instrText xml:space="preserve"> PAGEREF _Toc230038864 \h </w:instrText>
             </w:r>
             <w:r>
               <w:rPr>
@@ -3924,7 +3980,7 @@
                 <w:noProof/>
                 <w:webHidden/>
               </w:rPr>
-              <w:t>21</w:t>
+              <w:t>22</w:t>
             </w:r>
             <w:r>
               <w:rPr>
@@ -3949,7 +4005,7 @@
               <w14:ligatures w14:val="standardContextual"/>
             </w:rPr>
           </w:pPr>
-          <w:hyperlink w:anchor="_Toc229756216" w:history="1">
+          <w:hyperlink w:anchor="_Toc230038865" w:history="1">
             <w:r>
               <w:rPr>
                 <w:rStyle w:val="Kpr"/>
@@ -3976,7 +4032,7 @@
                 <w:noProof/>
                 <w:webHidden/>
               </w:rPr>
-              <w:instrText xml:space="preserve"> PAGEREF _Toc229756216 \h </w:instrText>
+              <w:instrText xml:space="preserve"> PAGEREF _Toc230038865 \h </w:instrText>
             </w:r>
             <w:r>
               <w:rPr>
@@ -3996,7 +4052,7 @@
                 <w:noProof/>
                 <w:webHidden/>
               </w:rPr>
-              <w:t>21</w:t>
+              <w:t>22</w:t>
             </w:r>
             <w:r>
               <w:rPr>
@@ -6083,7 +6139,7 @@
           <w:tab w:val="left" w:pos="360"/>
         </w:tabs>
       </w:pPr>
-      <w:bookmarkStart w:id="0" w:name="_Toc229756175"/>
+      <w:bookmarkStart w:id="0" w:name="_Toc230038824"/>
       <w:r>
         <w:lastRenderedPageBreak/>
         <w:t>1</w:t>
@@ -6113,7 +6169,7 @@
         </w:rPr>
         <w:t xml:space="preserve"> </w:t>
       </w:r>
-      <w:bookmarkStart w:id="1" w:name="_Toc229756176"/>
+      <w:bookmarkStart w:id="1" w:name="_Toc230038825"/>
       <w:r>
         <w:rPr>
           <w:rFonts w:ascii="Times New Roman" w:hAnsi="Times New Roman"/>
@@ -6142,7 +6198,7 @@
           <w:bCs/>
         </w:rPr>
       </w:pPr>
-      <w:bookmarkStart w:id="2" w:name="_Toc229756177"/>
+      <w:bookmarkStart w:id="2" w:name="_Toc230038826"/>
       <w:r>
         <w:rPr>
           <w:rFonts w:ascii="Times New Roman" w:hAnsi="Times New Roman"/>
@@ -6176,7 +6232,7 @@
           <w:bCs/>
         </w:rPr>
       </w:pPr>
-      <w:bookmarkStart w:id="3" w:name="_Toc229756178"/>
+      <w:bookmarkStart w:id="3" w:name="_Toc230038827"/>
       <w:r>
         <w:rPr>
           <w:rFonts w:ascii="Times New Roman" w:hAnsi="Times New Roman"/>
@@ -6207,7 +6263,7 @@
           <w:bCs/>
         </w:rPr>
       </w:pPr>
-      <w:bookmarkStart w:id="4" w:name="_Toc229756179"/>
+      <w:bookmarkStart w:id="4" w:name="_Toc230038828"/>
       <w:r>
         <w:rPr>
           <w:rFonts w:ascii="Times New Roman" w:hAnsi="Times New Roman"/>
@@ -6238,7 +6294,7 @@
           <w:bCs/>
         </w:rPr>
       </w:pPr>
-      <w:bookmarkStart w:id="5" w:name="_Toc229756180"/>
+      <w:bookmarkStart w:id="5" w:name="_Toc230038829"/>
       <w:r>
         <w:rPr>
           <w:rFonts w:ascii="Times New Roman" w:hAnsi="Times New Roman"/>
@@ -6270,7 +6326,7 @@
           <w:bCs/>
         </w:rPr>
       </w:pPr>
-      <w:bookmarkStart w:id="6" w:name="_Toc229756181"/>
+      <w:bookmarkStart w:id="6" w:name="_Toc230038830"/>
       <w:r>
         <w:rPr>
           <w:rFonts w:ascii="Times New Roman" w:hAnsi="Times New Roman"/>
@@ -6303,7 +6359,7 @@
           <w:bCs/>
         </w:rPr>
       </w:pPr>
-      <w:bookmarkStart w:id="7" w:name="_Toc229756182"/>
+      <w:bookmarkStart w:id="7" w:name="_Toc230038831"/>
       <w:r>
         <w:rPr>
           <w:b/>
@@ -6495,7 +6551,7 @@
           <w:rFonts w:ascii="Times New Roman" w:hAnsi="Times New Roman"/>
         </w:rPr>
       </w:pPr>
-      <w:bookmarkStart w:id="8" w:name="_Toc229756183"/>
+      <w:bookmarkStart w:id="8" w:name="_Toc230038832"/>
       <w:r>
         <w:rPr>
           <w:rFonts w:ascii="Times New Roman" w:hAnsi="Times New Roman"/>
@@ -6528,7 +6584,7 @@
           <w:tab w:val="left" w:pos="360"/>
         </w:tabs>
       </w:pPr>
-      <w:bookmarkStart w:id="9" w:name="_Toc229756184"/>
+      <w:bookmarkStart w:id="9" w:name="_Toc230038833"/>
       <w:r>
         <w:rPr>
           <w:rFonts w:ascii="Times New Roman" w:hAnsi="Times New Roman"/>
@@ -6558,7 +6614,7 @@
           <w:bCs/>
         </w:rPr>
       </w:pPr>
-      <w:bookmarkStart w:id="10" w:name="_Toc229756185"/>
+      <w:bookmarkStart w:id="10" w:name="_Toc230038834"/>
       <w:r>
         <w:rPr>
           <w:rFonts w:ascii="Times New Roman" w:hAnsi="Times New Roman"/>
@@ -6601,7 +6657,7 @@
           <w:bCs/>
         </w:rPr>
       </w:pPr>
-      <w:bookmarkStart w:id="11" w:name="_Toc229756186"/>
+      <w:bookmarkStart w:id="11" w:name="_Toc230038835"/>
       <w:r>
         <w:rPr>
           <w:rFonts w:ascii="Times New Roman" w:hAnsi="Times New Roman"/>
@@ -6640,7 +6696,7 @@
           <w:bCs/>
         </w:rPr>
       </w:pPr>
-      <w:bookmarkStart w:id="12" w:name="_Toc229756187"/>
+      <w:bookmarkStart w:id="12" w:name="_Toc230038836"/>
       <w:r>
         <w:rPr>
           <w:rFonts w:ascii="Times New Roman" w:hAnsi="Times New Roman"/>
@@ -6686,7 +6742,7 @@
           <w:bCs/>
         </w:rPr>
       </w:pPr>
-      <w:bookmarkStart w:id="13" w:name="_Toc229756188"/>
+      <w:bookmarkStart w:id="13" w:name="_Toc230038837"/>
       <w:r>
         <w:rPr>
           <w:rFonts w:ascii="Times New Roman" w:hAnsi="Times New Roman"/>
@@ -6726,7 +6782,7 @@
           <w:bCs/>
         </w:rPr>
       </w:pPr>
-      <w:bookmarkStart w:id="14" w:name="_Toc229756189"/>
+      <w:bookmarkStart w:id="14" w:name="_Toc230038838"/>
       <w:r>
         <w:rPr>
           <w:rFonts w:ascii="Times New Roman" w:hAnsi="Times New Roman"/>
@@ -6767,7 +6823,7 @@
           <w:numId w:val="0"/>
         </w:numPr>
       </w:pPr>
-      <w:bookmarkStart w:id="15" w:name="_Toc229756190"/>
+      <w:bookmarkStart w:id="15" w:name="_Toc230038839"/>
       <w:r>
         <w:t>2.7</w:t>
       </w:r>
@@ -8050,12 +8106,14 @@
         </w:numPr>
         <w:ind w:left="360"/>
       </w:pPr>
+      <w:bookmarkStart w:id="17" w:name="_Toc230038840"/>
       <w:r>
         <w:rPr>
           <w:rFonts w:ascii="Times New Roman" w:hAnsi="Times New Roman"/>
         </w:rPr>
         <w:t>2.8 Research Gap</w:t>
       </w:r>
+      <w:bookmarkEnd w:id="17"/>
     </w:p>
     <w:p>
       <w:r>
@@ -8218,7 +8276,7 @@
           <w:szCs w:val="32"/>
         </w:rPr>
       </w:pPr>
-      <w:bookmarkStart w:id="17" w:name="_Toc229756192"/>
+      <w:bookmarkStart w:id="18" w:name="_Toc230038841"/>
       <w:r>
         <w:lastRenderedPageBreak/>
         <w:t>3.</w:t>
@@ -8226,7 +8284,7 @@
       <w:r>
         <w:t xml:space="preserve"> Methodology</w:t>
       </w:r>
-      <w:bookmarkEnd w:id="17"/>
+      <w:bookmarkEnd w:id="18"/>
       <w:r>
         <w:br/>
       </w:r>
@@ -8243,7 +8301,7 @@
           <w:bCs/>
         </w:rPr>
       </w:pPr>
-      <w:bookmarkStart w:id="18" w:name="_Toc229756193"/>
+      <w:bookmarkStart w:id="19" w:name="_Toc230038842"/>
       <w:r>
         <w:rPr>
           <w:rStyle w:val="Balk2Char"/>
@@ -8252,7 +8310,7 @@
         </w:rPr>
         <w:t>3.1 Research Design</w:t>
       </w:r>
-      <w:bookmarkEnd w:id="18"/>
+      <w:bookmarkEnd w:id="19"/>
     </w:p>
     <w:p>
       <w:r>
@@ -8274,7 +8332,7 @@
           <w:bCs/>
         </w:rPr>
       </w:pPr>
-      <w:bookmarkStart w:id="19" w:name="_Toc229756194"/>
+      <w:bookmarkStart w:id="20" w:name="_Toc230038843"/>
       <w:r>
         <w:rPr>
           <w:rFonts w:ascii="Times New Roman" w:hAnsi="Times New Roman"/>
@@ -8283,7 +8341,7 @@
         </w:rPr>
         <w:t>3.2 Dataset and Case Description</w:t>
       </w:r>
-      <w:bookmarkEnd w:id="19"/>
+      <w:bookmarkEnd w:id="20"/>
     </w:p>
     <w:p>
       <w:r>
@@ -8309,7 +8367,7 @@
           <w:bCs/>
         </w:rPr>
       </w:pPr>
-      <w:bookmarkStart w:id="20" w:name="_Toc229756195"/>
+      <w:bookmarkStart w:id="21" w:name="_Toc230038844"/>
       <w:r>
         <w:rPr>
           <w:rFonts w:ascii="Times New Roman" w:hAnsi="Times New Roman"/>
@@ -8318,7 +8376,7 @@
         </w:rPr>
         <w:t>3.3 Parsing and Preprocessing Pipeline</w:t>
       </w:r>
-      <w:bookmarkEnd w:id="20"/>
+      <w:bookmarkEnd w:id="21"/>
     </w:p>
     <w:p>
       <w:r>
@@ -8340,7 +8398,7 @@
           <w:bCs/>
         </w:rPr>
       </w:pPr>
-      <w:bookmarkStart w:id="21" w:name="_Toc229756196"/>
+      <w:bookmarkStart w:id="22" w:name="_Toc230038845"/>
       <w:r>
         <w:rPr>
           <w:rFonts w:ascii="Times New Roman" w:hAnsi="Times New Roman"/>
@@ -8349,7 +8407,7 @@
         </w:rPr>
         <w:t>3.4 Thread-Based Window Construction</w:t>
       </w:r>
-      <w:bookmarkEnd w:id="21"/>
+      <w:bookmarkEnd w:id="22"/>
     </w:p>
     <w:p>
       <w:r>
@@ -8371,7 +8429,7 @@
           <w:bCs/>
         </w:rPr>
       </w:pPr>
-      <w:bookmarkStart w:id="22" w:name="_Toc229756197"/>
+      <w:bookmarkStart w:id="23" w:name="_Toc230038846"/>
       <w:r>
         <w:rPr>
           <w:rFonts w:ascii="Times New Roman" w:hAnsi="Times New Roman"/>
@@ -8380,7 +8438,7 @@
         </w:rPr>
         <w:t>3.5 Feature Encoding</w:t>
       </w:r>
-      <w:bookmarkEnd w:id="22"/>
+      <w:bookmarkEnd w:id="23"/>
     </w:p>
     <w:p>
       <w:r>
@@ -8403,7 +8461,7 @@
           <w:bCs/>
         </w:rPr>
       </w:pPr>
-      <w:bookmarkStart w:id="23" w:name="_Toc229756198"/>
+      <w:bookmarkStart w:id="24" w:name="_Toc230038847"/>
       <w:r>
         <w:rPr>
           <w:rFonts w:ascii="Times New Roman" w:hAnsi="Times New Roman"/>
@@ -8412,7 +8470,7 @@
         </w:rPr>
         <w:t>3.6 Models and Training Configuration</w:t>
       </w:r>
-      <w:bookmarkEnd w:id="23"/>
+      <w:bookmarkEnd w:id="24"/>
     </w:p>
     <w:p>
       <w:r>
@@ -8441,7 +8499,7 @@
           <w:bCs/>
         </w:rPr>
       </w:pPr>
-      <w:bookmarkStart w:id="24" w:name="_Toc229756199"/>
+      <w:bookmarkStart w:id="25" w:name="_Toc230038848"/>
       <w:r>
         <w:rPr>
           <w:rFonts w:ascii="Times New Roman" w:hAnsi="Times New Roman"/>
@@ -8450,7 +8508,7 @@
         </w:rPr>
         <w:t>3.7 Trace-Level Aggregation and Thresholding</w:t>
       </w:r>
-      <w:bookmarkEnd w:id="24"/>
+      <w:bookmarkEnd w:id="25"/>
     </w:p>
     <w:p>
       <w:r>
@@ -8473,7 +8531,7 @@
           <w:bCs/>
         </w:rPr>
       </w:pPr>
-      <w:bookmarkStart w:id="25" w:name="_Toc229756200"/>
+      <w:bookmarkStart w:id="26" w:name="_Toc230038849"/>
       <w:r>
         <w:rPr>
           <w:rFonts w:ascii="Times New Roman" w:hAnsi="Times New Roman"/>
@@ -8482,7 +8540,7 @@
         </w:rPr>
         <w:t>3.8 Evaluation Metrics</w:t>
       </w:r>
-      <w:bookmarkEnd w:id="25"/>
+      <w:bookmarkEnd w:id="26"/>
     </w:p>
     <w:p>
       <w:r>
@@ -8504,7 +8562,7 @@
           <w:bCs/>
         </w:rPr>
       </w:pPr>
-      <w:bookmarkStart w:id="26" w:name="_Toc229756201"/>
+      <w:bookmarkStart w:id="27" w:name="_Toc230038850"/>
       <w:r>
         <w:rPr>
           <w:rFonts w:ascii="Times New Roman" w:hAnsi="Times New Roman"/>
@@ -8513,7 +8571,7 @@
         </w:rPr>
         <w:t>3.9 Implementation Environment and Repository Structure</w:t>
       </w:r>
-      <w:bookmarkEnd w:id="26"/>
+      <w:bookmarkEnd w:id="27"/>
     </w:p>
     <w:p>
       <w:r>
@@ -8535,7 +8593,7 @@
           <w:bCs/>
         </w:rPr>
       </w:pPr>
-      <w:bookmarkStart w:id="27" w:name="_Toc229756202"/>
+      <w:bookmarkStart w:id="28" w:name="_Toc230038851"/>
       <w:r>
         <w:rPr>
           <w:rFonts w:ascii="Times New Roman" w:hAnsi="Times New Roman"/>
@@ -8544,7 +8602,7 @@
         </w:rPr>
         <w:t>3.10 Dataset and Experimental Setup Summary</w:t>
       </w:r>
-      <w:bookmarkEnd w:id="27"/>
+      <w:bookmarkEnd w:id="28"/>
     </w:p>
     <w:p>
       <w:pPr>
@@ -8556,7 +8614,7 @@
           <w:szCs w:val="22"/>
         </w:rPr>
       </w:pPr>
-      <w:bookmarkStart w:id="28" w:name="_Toc229756741"/>
+      <w:bookmarkStart w:id="29" w:name="_Toc229756741"/>
       <w:r>
         <w:rPr>
           <w:sz w:val="22"/>
@@ -8608,7 +8666,7 @@
         </w:rPr>
         <w:t xml:space="preserve"> Dataset and experimental setup used in this project.</w:t>
       </w:r>
-      <w:bookmarkEnd w:id="28"/>
+      <w:bookmarkEnd w:id="29"/>
     </w:p>
     <w:tbl>
       <w:tblPr>
@@ -9465,7 +9523,7 @@
           <w:rFonts w:ascii="Times New Roman" w:hAnsi="Times New Roman"/>
         </w:rPr>
       </w:pPr>
-      <w:bookmarkStart w:id="29" w:name="_Toc229756203"/>
+      <w:bookmarkStart w:id="30" w:name="_Toc230038852"/>
       <w:r>
         <w:rPr>
           <w:rFonts w:ascii="Times New Roman" w:hAnsi="Times New Roman"/>
@@ -9485,7 +9543,7 @@
         </w:rPr>
         <w:t xml:space="preserve"> Results</w:t>
       </w:r>
-      <w:bookmarkEnd w:id="29"/>
+      <w:bookmarkEnd w:id="30"/>
     </w:p>
     <w:p>
       <w:pPr>
@@ -9496,7 +9554,7 @@
         </w:numPr>
         <w:ind w:left="360" w:hanging="360"/>
       </w:pPr>
-      <w:bookmarkStart w:id="30" w:name="_Toc229756204"/>
+      <w:bookmarkStart w:id="31" w:name="_Toc230038853"/>
       <w:r>
         <w:rPr>
           <w:rFonts w:ascii="Times New Roman" w:hAnsi="Times New Roman"/>
@@ -9509,7 +9567,7 @@
         </w:rPr>
         <w:t xml:space="preserve"> Experimental Setup and Operating Points</w:t>
       </w:r>
-      <w:bookmarkEnd w:id="30"/>
+      <w:bookmarkEnd w:id="31"/>
     </w:p>
     <w:p>
       <w:r>
@@ -9527,14 +9585,14 @@
           <w:numId w:val="0"/>
         </w:numPr>
       </w:pPr>
-      <w:bookmarkStart w:id="31" w:name="_Toc229756205"/>
+      <w:bookmarkStart w:id="32" w:name="_Toc230038854"/>
       <w:r>
         <w:rPr>
           <w:rFonts w:ascii="Times New Roman" w:hAnsi="Times New Roman"/>
         </w:rPr>
         <w:t>4.2 ROC-AUC Summary</w:t>
       </w:r>
-      <w:bookmarkEnd w:id="31"/>
+      <w:bookmarkEnd w:id="32"/>
     </w:p>
     <w:p>
       <w:pPr>
@@ -9554,7 +9612,7 @@
           <w:szCs w:val="22"/>
         </w:rPr>
       </w:pPr>
-      <w:bookmarkStart w:id="32" w:name="_Toc229756742"/>
+      <w:bookmarkStart w:id="33" w:name="_Toc229756742"/>
       <w:r>
         <w:rPr>
           <w:sz w:val="22"/>
@@ -9606,7 +9664,7 @@
         </w:rPr>
         <w:t xml:space="preserve"> ROC-AUC comparison on test traces.</w:t>
       </w:r>
-      <w:bookmarkEnd w:id="32"/>
+      <w:bookmarkEnd w:id="33"/>
     </w:p>
     <w:tbl>
       <w:tblPr>
@@ -9823,7 +9881,7 @@
         <w:pStyle w:val="ResimYazs"/>
         <w:jc w:val="center"/>
       </w:pPr>
-      <w:bookmarkStart w:id="33" w:name="_Toc229757143"/>
+      <w:bookmarkStart w:id="34" w:name="_Toc229757143"/>
       <w:r>
         <w:rPr>
           <w:sz w:val="22"/>
@@ -9894,7 +9952,7 @@
       <w:r>
         <w:t>.</w:t>
       </w:r>
-      <w:bookmarkEnd w:id="33"/>
+      <w:bookmarkEnd w:id="34"/>
     </w:p>
     <w:p>
       <w:pPr>
@@ -9918,14 +9976,14 @@
           <w:numId w:val="0"/>
         </w:numPr>
       </w:pPr>
-      <w:bookmarkStart w:id="34" w:name="_Toc229756206"/>
+      <w:bookmarkStart w:id="35" w:name="_Toc230038855"/>
       <w:r>
         <w:rPr>
           <w:rFonts w:ascii="Times New Roman" w:hAnsi="Times New Roman"/>
         </w:rPr>
         <w:t>4.3 Main Comparison at Validation-Normal q95</w:t>
       </w:r>
-      <w:bookmarkEnd w:id="34"/>
+      <w:bookmarkEnd w:id="35"/>
     </w:p>
     <w:p/>
     <w:p>
@@ -9938,7 +9996,7 @@
           <w:szCs w:val="22"/>
         </w:rPr>
       </w:pPr>
-      <w:bookmarkStart w:id="35" w:name="_Toc229756743"/>
+      <w:bookmarkStart w:id="36" w:name="_Toc229756743"/>
       <w:r>
         <w:rPr>
           <w:sz w:val="22"/>
@@ -9990,7 +10048,7 @@
         </w:rPr>
         <w:t xml:space="preserve"> Main trace-level comparison at validation-normal q95 thresholds.</w:t>
       </w:r>
-      <w:bookmarkEnd w:id="35"/>
+      <w:bookmarkEnd w:id="36"/>
     </w:p>
     <w:tbl>
       <w:tblPr>
@@ -10795,14 +10853,14 @@
           <w:numId w:val="0"/>
         </w:numPr>
       </w:pPr>
-      <w:bookmarkStart w:id="36" w:name="_Toc229756207"/>
+      <w:bookmarkStart w:id="37" w:name="_Toc230038856"/>
       <w:r>
         <w:rPr>
           <w:rFonts w:ascii="Times New Roman" w:hAnsi="Times New Roman"/>
         </w:rPr>
         <w:t>4.4 Confusion Matrix and Score Distribution Analysis</w:t>
       </w:r>
-      <w:bookmarkEnd w:id="36"/>
+      <w:bookmarkEnd w:id="37"/>
     </w:p>
     <w:p/>
     <w:p>
@@ -10860,7 +10918,7 @@
           <w:szCs w:val="22"/>
         </w:rPr>
       </w:pPr>
-      <w:bookmarkStart w:id="37" w:name="_Toc229757144"/>
+      <w:bookmarkStart w:id="38" w:name="_Toc229757144"/>
       <w:r>
         <w:rPr>
           <w:sz w:val="22"/>
@@ -10912,7 +10970,7 @@
         </w:rPr>
         <w:t xml:space="preserve"> STIDE confusion matrix at q95.</w:t>
       </w:r>
-      <w:bookmarkEnd w:id="37"/>
+      <w:bookmarkEnd w:id="38"/>
     </w:p>
     <w:p>
       <w:pPr>
@@ -10974,7 +11032,7 @@
           <w:szCs w:val="22"/>
         </w:rPr>
       </w:pPr>
-      <w:bookmarkStart w:id="38" w:name="_Toc229757145"/>
+      <w:bookmarkStart w:id="39" w:name="_Toc229757145"/>
       <w:r>
         <w:rPr>
           <w:sz w:val="22"/>
@@ -11042,7 +11100,7 @@
         </w:rPr>
         <w:t xml:space="preserve"> confusion matrix at q95.</w:t>
       </w:r>
-      <w:bookmarkEnd w:id="38"/>
+      <w:bookmarkEnd w:id="39"/>
     </w:p>
     <w:p>
       <w:pPr>
@@ -11105,7 +11163,7 @@
           <w:szCs w:val="22"/>
         </w:rPr>
       </w:pPr>
-      <w:bookmarkStart w:id="39" w:name="_Toc229757146"/>
+      <w:bookmarkStart w:id="40" w:name="_Toc229757146"/>
       <w:r>
         <w:rPr>
           <w:sz w:val="22"/>
@@ -11157,7 +11215,7 @@
         </w:rPr>
         <w:t xml:space="preserve"> LSTM Context confusion matrix at q95.</w:t>
       </w:r>
-      <w:bookmarkEnd w:id="39"/>
+      <w:bookmarkEnd w:id="40"/>
     </w:p>
     <w:p>
       <w:pPr>
@@ -11221,7 +11279,7 @@
           <w:szCs w:val="22"/>
         </w:rPr>
       </w:pPr>
-      <w:bookmarkStart w:id="40" w:name="_Toc229757147"/>
+      <w:bookmarkStart w:id="41" w:name="_Toc229757147"/>
       <w:r>
         <w:rPr>
           <w:sz w:val="22"/>
@@ -11273,7 +11331,7 @@
         </w:rPr>
         <w:t xml:space="preserve"> STIDE trace-score distribution.</w:t>
       </w:r>
-      <w:bookmarkEnd w:id="40"/>
+      <w:bookmarkEnd w:id="41"/>
     </w:p>
     <w:p>
       <w:pPr>
@@ -11335,7 +11393,7 @@
           <w:szCs w:val="22"/>
         </w:rPr>
       </w:pPr>
-      <w:bookmarkStart w:id="41" w:name="_Toc229757148"/>
+      <w:bookmarkStart w:id="42" w:name="_Toc229757148"/>
       <w:r>
         <w:rPr>
           <w:sz w:val="22"/>
@@ -11403,7 +11461,7 @@
         </w:rPr>
         <w:t xml:space="preserve"> trace-score distribution.</w:t>
       </w:r>
-      <w:bookmarkEnd w:id="41"/>
+      <w:bookmarkEnd w:id="42"/>
     </w:p>
     <w:p>
       <w:pPr>
@@ -11466,7 +11524,7 @@
           <w:szCs w:val="22"/>
         </w:rPr>
       </w:pPr>
-      <w:bookmarkStart w:id="42" w:name="_Toc229757149"/>
+      <w:bookmarkStart w:id="43" w:name="_Toc229757149"/>
       <w:r>
         <w:rPr>
           <w:sz w:val="22"/>
@@ -11518,7 +11576,7 @@
         </w:rPr>
         <w:t xml:space="preserve"> LSTM Context trace-score distribution.</w:t>
       </w:r>
-      <w:bookmarkEnd w:id="42"/>
+      <w:bookmarkEnd w:id="43"/>
     </w:p>
     <w:p>
       <w:pPr>
@@ -11541,14 +11599,14 @@
           <w:numId w:val="0"/>
         </w:numPr>
       </w:pPr>
-      <w:bookmarkStart w:id="43" w:name="_Toc229756208"/>
+      <w:bookmarkStart w:id="44" w:name="_Toc230038857"/>
       <w:r>
         <w:rPr>
           <w:rFonts w:ascii="Times New Roman" w:hAnsi="Times New Roman"/>
         </w:rPr>
         <w:t>4.5 Sensitivity Analysis with q90 Thresholds</w:t>
       </w:r>
-      <w:bookmarkEnd w:id="43"/>
+      <w:bookmarkEnd w:id="44"/>
     </w:p>
     <w:p/>
     <w:p>
@@ -11561,7 +11619,7 @@
           <w:szCs w:val="22"/>
         </w:rPr>
       </w:pPr>
-      <w:bookmarkStart w:id="44" w:name="_Toc229756744"/>
+      <w:bookmarkStart w:id="45" w:name="_Toc229756744"/>
       <w:r>
         <w:rPr>
           <w:sz w:val="22"/>
@@ -11613,7 +11671,7 @@
         </w:rPr>
         <w:t xml:space="preserve"> Sensitivity comparison at validation-normal q90 thresholds.</w:t>
       </w:r>
-      <w:bookmarkEnd w:id="44"/>
+      <w:bookmarkEnd w:id="45"/>
     </w:p>
     <w:tbl>
       <w:tblPr>
@@ -12418,7 +12476,7 @@
           <w:numId w:val="0"/>
         </w:numPr>
       </w:pPr>
-      <w:bookmarkStart w:id="45" w:name="_Toc229756209"/>
+      <w:bookmarkStart w:id="46" w:name="_Toc230038858"/>
       <w:r>
         <w:rPr>
           <w:rFonts w:ascii="Times New Roman" w:hAnsi="Times New Roman"/>
@@ -12426,7 +12484,7 @@
         <w:lastRenderedPageBreak/>
         <w:t>4.6 Original Thresholding and Reliability Summaries</w:t>
       </w:r>
-      <w:bookmarkEnd w:id="45"/>
+      <w:bookmarkEnd w:id="46"/>
     </w:p>
     <w:p>
       <w:pPr>
@@ -12445,7 +12503,7 @@
           <w:szCs w:val="22"/>
         </w:rPr>
       </w:pPr>
-      <w:bookmarkStart w:id="46" w:name="_Toc229756745"/>
+      <w:bookmarkStart w:id="47" w:name="_Toc229756745"/>
       <w:r>
         <w:rPr>
           <w:sz w:val="22"/>
@@ -12497,7 +12555,7 @@
         </w:rPr>
         <w:t xml:space="preserve"> Original validation-based thresholding comparison (supporting).</w:t>
       </w:r>
-      <w:bookmarkEnd w:id="46"/>
+      <w:bookmarkEnd w:id="47"/>
     </w:p>
     <w:tbl>
       <w:tblPr>
@@ -13013,7 +13071,7 @@
           <w:szCs w:val="22"/>
         </w:rPr>
       </w:pPr>
-      <w:bookmarkStart w:id="47" w:name="_Toc229756746"/>
+      <w:bookmarkStart w:id="48" w:name="_Toc229756746"/>
       <w:r>
         <w:rPr>
           <w:sz w:val="22"/>
@@ -13065,7 +13123,7 @@
         </w:rPr>
         <w:t xml:space="preserve"> Bootstrap q95 reliability summary (mean metrics).</w:t>
       </w:r>
-      <w:bookmarkEnd w:id="47"/>
+      <w:bookmarkEnd w:id="48"/>
     </w:p>
     <w:tbl>
       <w:tblPr>
@@ -13591,7 +13649,7 @@
           <w:szCs w:val="22"/>
         </w:rPr>
       </w:pPr>
-      <w:bookmarkStart w:id="48" w:name="_Toc229756747"/>
+      <w:bookmarkStart w:id="49" w:name="_Toc229756747"/>
       <w:r>
         <w:rPr>
           <w:sz w:val="22"/>
@@ -13643,7 +13701,7 @@
         </w:rPr>
         <w:t xml:space="preserve"> Error analysis summary at q95.</w:t>
       </w:r>
-      <w:bookmarkEnd w:id="48"/>
+      <w:bookmarkEnd w:id="49"/>
     </w:p>
     <w:tbl>
       <w:tblPr>
@@ -14105,14 +14163,14 @@
           <w:numId w:val="0"/>
         </w:numPr>
       </w:pPr>
-      <w:bookmarkStart w:id="49" w:name="_Toc229756210"/>
+      <w:bookmarkStart w:id="50" w:name="_Toc230038859"/>
       <w:r>
         <w:rPr>
           <w:rFonts w:ascii="Times New Roman" w:hAnsi="Times New Roman"/>
         </w:rPr>
         <w:t>4.7 Summary of Findings</w:t>
       </w:r>
-      <w:bookmarkEnd w:id="49"/>
+      <w:bookmarkEnd w:id="50"/>
     </w:p>
     <w:p>
       <w:r>
@@ -14281,7 +14339,7 @@
         </w:numPr>
         <w:ind w:left="360"/>
       </w:pPr>
-      <w:bookmarkStart w:id="50" w:name="_Toc229756211"/>
+      <w:bookmarkStart w:id="51" w:name="_Toc230038860"/>
       <w:r>
         <w:lastRenderedPageBreak/>
         <w:t>5</w:t>
@@ -14296,7 +14354,7 @@
       <w:r>
         <w:t>Conslusion</w:t>
       </w:r>
-      <w:bookmarkEnd w:id="50"/>
+      <w:bookmarkEnd w:id="51"/>
       <w:proofErr w:type="spellEnd"/>
     </w:p>
     <w:p>
@@ -14312,7 +14370,7 @@
           <w:i/>
         </w:rPr>
       </w:pPr>
-      <w:bookmarkStart w:id="51" w:name="_Toc229756212"/>
+      <w:bookmarkStart w:id="52" w:name="_Toc230038861"/>
       <w:r>
         <w:rPr>
           <w:rStyle w:val="Balk2Char"/>
@@ -14320,7 +14378,7 @@
         </w:rPr>
         <w:t>5.1 Discussion of Key Findings</w:t>
       </w:r>
-      <w:bookmarkEnd w:id="51"/>
+      <w:bookmarkEnd w:id="52"/>
     </w:p>
     <w:p>
       <w:r>
@@ -14338,14 +14396,14 @@
           <w:numId w:val="0"/>
         </w:numPr>
       </w:pPr>
-      <w:bookmarkStart w:id="52" w:name="_Toc229756213"/>
+      <w:bookmarkStart w:id="53" w:name="_Toc230038862"/>
       <w:r>
         <w:rPr>
           <w:rFonts w:ascii="Times New Roman" w:hAnsi="Times New Roman"/>
         </w:rPr>
         <w:t>5.2 Practical Implications</w:t>
       </w:r>
-      <w:bookmarkEnd w:id="52"/>
+      <w:bookmarkEnd w:id="53"/>
     </w:p>
     <w:p>
       <w:r>
@@ -14366,14 +14424,14 @@
           <w:tab w:val="left" w:pos="540"/>
         </w:tabs>
       </w:pPr>
-      <w:bookmarkStart w:id="53" w:name="_Toc229756214"/>
+      <w:bookmarkStart w:id="54" w:name="_Toc230038863"/>
       <w:r>
         <w:rPr>
           <w:rFonts w:ascii="Times New Roman" w:hAnsi="Times New Roman"/>
         </w:rPr>
         <w:t>5.3 Limitations</w:t>
       </w:r>
-      <w:bookmarkEnd w:id="53"/>
+      <w:bookmarkEnd w:id="54"/>
     </w:p>
     <w:p>
       <w:r>
@@ -14391,14 +14449,14 @@
           <w:numId w:val="0"/>
         </w:numPr>
       </w:pPr>
-      <w:bookmarkStart w:id="54" w:name="_Toc229756215"/>
+      <w:bookmarkStart w:id="55" w:name="_Toc230038864"/>
       <w:r>
         <w:rPr>
           <w:rFonts w:ascii="Times New Roman" w:hAnsi="Times New Roman"/>
         </w:rPr>
         <w:t>5.4 Future Work</w:t>
       </w:r>
-      <w:bookmarkEnd w:id="54"/>
+      <w:bookmarkEnd w:id="55"/>
     </w:p>
     <w:p>
       <w:r>
@@ -14417,14 +14475,14 @@
         </w:numPr>
         <w:ind w:left="360" w:hanging="360"/>
       </w:pPr>
-      <w:bookmarkStart w:id="55" w:name="_Toc229756216"/>
+      <w:bookmarkStart w:id="56" w:name="_Toc230038865"/>
       <w:r>
         <w:rPr>
           <w:rFonts w:ascii="Times New Roman" w:hAnsi="Times New Roman"/>
         </w:rPr>
         <w:t>5.5 Conclusion</w:t>
       </w:r>
-      <w:bookmarkEnd w:id="55"/>
+      <w:bookmarkEnd w:id="56"/>
     </w:p>
     <w:p>
       <w:r>
@@ -14600,7 +14658,7 @@
           <w:szCs w:val="22"/>
         </w:rPr>
       </w:pPr>
-      <w:bookmarkStart w:id="56" w:name="_Toc229757150"/>
+      <w:bookmarkStart w:id="57" w:name="_Toc229757150"/>
       <w:r>
         <w:rPr>
           <w:sz w:val="22"/>
@@ -14668,7 +14726,7 @@
         </w:rPr>
         <w:t>).</w:t>
       </w:r>
-      <w:bookmarkEnd w:id="56"/>
+      <w:bookmarkEnd w:id="57"/>
     </w:p>
     <w:p>
       <w:pPr>
@@ -14691,19 +14749,7 @@
           <w:rPr>
             <w:rStyle w:val="Kpr"/>
           </w:rPr>
-          <w:t>https://gith</w:t>
-        </w:r>
-        <w:r>
-          <w:rPr>
-            <w:rStyle w:val="Kpr"/>
-          </w:rPr>
-          <w:t>u</w:t>
-        </w:r>
-        <w:r>
-          <w:rPr>
-            <w:rStyle w:val="Kpr"/>
-          </w:rPr>
-          <w:t>b.com/Emirhanmu/LSTM-Based-HIDS-on-System-Call-Sequences</w:t>
+          <w:t>https://github.com/Emirhanmu/LSTM-Based-HIDS-on-System-Call-Sequences</w:t>
         </w:r>
       </w:hyperlink>
       <w:r>

</xml_diff>